<commit_message>
Add Kawakita poetry style notes, dream diary entries, and doc updates
New reference doc on Kawakita's haiku technique, five days of dream
journal entries, plus minor updates to hundred-year-plan scan, Totman
notes, Kinjo seminar note, and people register.

Co-Authored-By: Claude Sonnet 5 <noreply@anthropic.com>
</commit_message>
<xml_diff>
--- a/docs/outreach/kinjo_naist_seminar_note.docx
+++ b/docs/outreach/kinjo_naist_seminar_note.docx
@@ -29,7 +29,27 @@
           <w:sz w:val="16"/>
           <w:szCs w:val="16"/>
         </w:rPr>
-        <w:t xml:space="preserve">金城さん</w:t>
+      </w:r>
+      <w:r>
+        <w:rPr>
+          <w:rFonts w:ascii="Noto Sans CJK JP" w:hAnsi="Noto Sans CJK JP" w:eastAsia="Noto Sans CJK JP" w:cs="Noto Sans CJK JP"/>
+          <w:b/>
+          <w:bCs/>
+          <w:color w:val="333333"/>
+          <w:sz w:val="16"/>
+          <w:szCs w:val="16"/>
+        </w:rPr>
+        <w:t xml:space="preserve">近処さん</w:t>
+      </w:r>
+      <w:r>
+        <w:rPr>
+          <w:rFonts w:ascii="Noto Sans CJK JP" w:hAnsi="Noto Sans CJK JP" w:eastAsia="Noto Sans CJK JP" w:cs="Noto Sans CJK JP"/>
+          <w:b/>
+          <w:bCs/>
+          <w:color w:val="333333"/>
+          <w:sz w:val="16"/>
+          <w:szCs w:val="16"/>
+        </w:rPr>
       </w:r>
       <w:r>
         <w:rPr>
@@ -307,15 +327,15 @@
         <mc:AlternateContent>
           <mc:Choice Requires="wpg">
             <w:drawing>
-              <wp:anchor xmlns:wp="http://schemas.openxmlformats.org/drawingml/2006/wordprocessingDrawing" xmlns:wp14="http://schemas.microsoft.com/office/word/2010/wordprocessingDrawing" distT="0" distB="0" distL="115200" distR="115200" simplePos="0" relativeHeight="2048" behindDoc="1" locked="0" layoutInCell="1" allowOverlap="1">
+              <wp:anchor xmlns:wp="http://schemas.openxmlformats.org/drawingml/2006/wordprocessingDrawing" xmlns:wp14="http://schemas.microsoft.com/office/word/2010/wordprocessingDrawing" distT="0" distB="0" distL="115200" distR="115200" simplePos="0" relativeHeight="5120" behindDoc="1" locked="0" layoutInCell="1" allowOverlap="1">
                 <wp:simplePos x="0" y="0"/>
                 <wp:positionH relativeFrom="column">
-                  <wp:posOffset>0</wp:posOffset>
+                  <wp:posOffset>453953</wp:posOffset>
                 </wp:positionH>
                 <wp:positionV relativeFrom="paragraph">
-                  <wp:posOffset>1074549</wp:posOffset>
+                  <wp:posOffset>846560</wp:posOffset>
                 </wp:positionV>
-                <wp:extent cx="1922692" cy="2004015"/>
+                <wp:extent cx="1108193" cy="1098529"/>
                 <wp:effectExtent l="0" t="0" r="0" b="0"/>
                 <wp:wrapNone/>
                 <wp:docPr id="1" name=""/>
@@ -326,7 +346,7 @@
                   <a:graphicData uri="http://schemas.openxmlformats.org/drawingml/2006/picture">
                     <pic:pic xmlns:pic="http://schemas.openxmlformats.org/drawingml/2006/picture">
                       <pic:nvPicPr>
-                        <pic:cNvPr id="1566197005" name=""/>
+                        <pic:cNvPr id="1839944716" name=""/>
                         <pic:cNvPicPr>
                           <a:picLocks noChangeAspect="1"/>
                         </pic:cNvPicPr>
@@ -339,7 +359,7 @@
                       <pic:spPr bwMode="auto">
                         <a:xfrm flipH="0" flipV="0">
                           <a:off x="0" y="0"/>
-                          <a:ext cx="1922692" cy="2004014"/>
+                          <a:ext cx="1108193" cy="1098528"/>
                         </a:xfrm>
                         <a:prstGeom prst="rect">
                           <a:avLst/>
@@ -372,7 +392,7 @@
                 <v:path o:extrusionok="f" gradientshapeok="t" o:connecttype="rect"/>
                 <o:lock v:ext="edit" aspectratio="t"/>
               </v:shapetype>
-              <v:shape id="_x0000_i0" o:spid="_x0000_s0" type="#_x0000_t75" style="position:absolute;z-index:-2048;o:allowoverlap:true;o:allowincell:true;mso-position-horizontal-relative:text;margin-left:0.00pt;mso-position-horizontal:absolute;mso-position-vertical-relative:text;margin-top:84.61pt;mso-position-vertical:absolute;width:151.39pt;height:157.80pt;mso-wrap-distance-left:9.07pt;mso-wrap-distance-top:0.00pt;mso-wrap-distance-right:9.07pt;mso-wrap-distance-bottom:0.00pt;z-index:1;" stroked="false">
+              <v:shape id="_x0000_i0" o:spid="_x0000_s0" type="#_x0000_t75" style="position:absolute;z-index:-5120;o:allowoverlap:true;o:allowincell:true;mso-position-horizontal-relative:text;margin-left:35.74pt;mso-position-horizontal:absolute;mso-position-vertical-relative:text;margin-top:66.66pt;mso-position-vertical:absolute;width:87.26pt;height:86.50pt;mso-wrap-distance-left:9.07pt;mso-wrap-distance-top:0.00pt;mso-wrap-distance-right:9.07pt;mso-wrap-distance-bottom:0.00pt;z-index:1;" stroked="false">
                 <v:imagedata r:id="rId8" o:title=""/>
                 <o:lock v:ext="edit" rotation="t"/>
               </v:shape>
@@ -380,6 +400,17 @@
           </mc:Fallback>
         </mc:AlternateContent>
       </w:r>
+      <w:r>
+        <w:rPr>
+          <w:rFonts w:ascii="Noto Sans CJK JP" w:hAnsi="Noto Sans CJK JP" w:eastAsia="Noto Sans CJK JP" w:cs="Noto Sans CJK JP"/>
+          <w:b/>
+          <w:bCs/>
+          <w:color w:val="333333"/>
+          <w:sz w:val="16"/>
+          <w:szCs w:val="16"/>
+        </w:rPr>
+      </w:r>
+      <w:r/>
       <w:r>
         <w:rPr>
           <w:rFonts w:ascii="Noto Sans CJK JP" w:hAnsi="Noto Sans CJK JP" w:eastAsia="Noto Sans CJK JP" w:cs="Noto Sans CJK JP"/>
@@ -428,6 +459,17 @@
           <w:sz w:val="16"/>
           <w:szCs w:val="16"/>
         </w:rPr>
+      </w:r>
+      <w:r/>
+      <w:r>
+        <w:rPr>
+          <w:rFonts w:ascii="Noto Sans CJK JP" w:hAnsi="Noto Sans CJK JP" w:eastAsia="Noto Sans CJK JP" w:cs="Noto Sans CJK JP"/>
+          <w:b/>
+          <w:bCs/>
+          <w:color w:val="333333"/>
+          <w:sz w:val="16"/>
+          <w:szCs w:val="16"/>
+        </w:rPr>
         <w:t xml:space="preserve">ロブ</w:t>
       </w:r>
       <w:r>
@@ -453,6 +495,16 @@
           <w:szCs w:val="16"/>
         </w:rPr>
       </w:pPr>
+      <w:r>
+        <w:rPr>
+          <w:rFonts w:ascii="Noto Sans CJK JP" w:hAnsi="Noto Sans CJK JP" w:eastAsia="Noto Sans CJK JP" w:cs="Noto Sans CJK JP"/>
+          <w:b/>
+          <w:bCs/>
+          <w:sz w:val="16"/>
+          <w:szCs w:val="16"/>
+        </w:rPr>
+      </w:r>
+      <w:r/>
       <w:r>
         <w:rPr>
           <w:rFonts w:ascii="Noto Sans CJK JP" w:hAnsi="Noto Sans CJK JP" w:eastAsia="Noto Sans CJK JP" w:cs="Noto Sans CJK JP"/>

</xml_diff>